<commit_message>
auto: XHS cards — 2026-07-24
</commit_message>
<xml_diff>
--- a/docs/xhs/2026-07-24/科技报/发布文案.docx
+++ b/docs/xhs/2026-07-24/科技报/发布文案.docx
@@ -75,7 +75,7 @@
         <w:rPr>
           <w:sz w:val="24"/>
         </w:rPr>
-        <w:t>#1 ★★★★★  AMD推出Helios AI机架系统挑战Nvidia</w:t>
+        <w:t>#1 ★★★★★  AMD发布Helios AI机架系统挑战英伟达</w:t>
       </w:r>
     </w:p>
     <w:p>
@@ -92,7 +92,7 @@
         <w:pStyle w:val="ListBullet"/>
       </w:pPr>
       <w:r>
-        <w:t>AMD发布Helios AI机架系统，直接挑战其芯片竞争对手Nvidia。该系统将于今年晚些时候开始向客户发货，标志着AMD在AI基础设施领域迈出重要一步，有望打破Nvidia在AI训练和推理硬件市场的主导地位。</w:t>
+        <w:t>AMD推出全新Helios AI机架系统，直接对标英伟达在AI基础设施领域的统治地位。该系统将于今年晚些时候开始向客户发货，标志着AMD在AI硬件赛道上的重大战略升级，有望改变当前AI芯片市场格局。</w:t>
       </w:r>
     </w:p>
     <w:p>
@@ -113,7 +113,7 @@
         <w:rPr>
           <w:sz w:val="24"/>
         </w:rPr>
-        <w:t>#2 ★★★★☆  Anthropic为Claude Opus和Sonnet更新语音模式</w:t>
+        <w:t>#2 ★★★★★  OpenAI向全美用户开放ChatGPT Health</w:t>
       </w:r>
     </w:p>
     <w:p>
@@ -130,7 +130,45 @@
         <w:pStyle w:val="ListBullet"/>
       </w:pPr>
       <w:r>
-        <w:t>Anthropic将Claude的语音模式扩展至更强大的Opus和Sonnet模型，此前仅限Haiku。新语音模式支持日程管理和邮件起草等任务，并集成Gmail、Slack和Canva等应用，显著提升了Claude的实用性和用户体验。</w:t>
+        <w:t>OpenAI正式向所有美国用户开放ChatGPT Health功能，允许用户连接Apple Health、MyFitnessPal等平台的个人健康数据。OpenAI宣称其模型已具备医疗级分析能力，但此前有牧师起诉称ChatGPT的健康建议险些致命，引发安全争议。</w:t>
+      </w:r>
+    </w:p>
+    <w:p>
+      <w:r>
+        <w:rPr>
+          <w:color w:val="3366CC"/>
+          <w:sz w:val="18"/>
+        </w:rPr>
+        <w:t>https://techcrunch.com/2026/07/23/openai-makes-chatgpt-health-available-to-all-u-s-users/</w:t>
+      </w:r>
+    </w:p>
+    <w:p/>
+    <w:p>
+      <w:pPr>
+        <w:pStyle w:val="Heading3"/>
+      </w:pPr>
+      <w:r>
+        <w:rPr>
+          <w:sz w:val="24"/>
+        </w:rPr>
+        <w:t>#3 ★★★★★  Anthropic为Claude语音模式升级更强模型</w:t>
+      </w:r>
+    </w:p>
+    <w:p>
+      <w:r>
+        <w:rPr>
+          <w:color w:val="888888"/>
+          <w:sz w:val="18"/>
+        </w:rPr>
+        <w:t>来源: TechCrunch</w:t>
+      </w:r>
+    </w:p>
+    <w:p>
+      <w:pPr>
+        <w:pStyle w:val="ListBullet"/>
+      </w:pPr>
+      <w:r>
+        <w:t>Anthropic将Claude语音模式从仅支持Haiku扩展到Opus和Sonnet模型，并集成Gmail、Slack、Canva等应用。新语音模式可执行日程调整、邮件起草等复杂任务，大幅提升语音AI的实用性和交互深度。</w:t>
       </w:r>
     </w:p>
     <w:p>
@@ -151,45 +189,7 @@
         <w:rPr>
           <w:sz w:val="24"/>
         </w:rPr>
-        <w:t>#3 ★★★★★  OpenAI向所有美国用户开放ChatGPT Health</w:t>
-      </w:r>
-    </w:p>
-    <w:p>
-      <w:r>
-        <w:rPr>
-          <w:color w:val="888888"/>
-          <w:sz w:val="18"/>
-        </w:rPr>
-        <w:t>来源: The Verge</w:t>
-      </w:r>
-    </w:p>
-    <w:p>
-      <w:pPr>
-        <w:pStyle w:val="ListBullet"/>
-      </w:pPr>
-      <w:r>
-        <w:t>OpenAI宣布ChatGPT Health向所有美国用户开放，允许用户连接Apple Health、MyFitnessPal等个人健康数据。公司声称其模型现在具备医疗级能力，此举可能改变数字健康管理格局，但也引发隐私和准确性担忧。</w:t>
-      </w:r>
-    </w:p>
-    <w:p>
-      <w:r>
-        <w:rPr>
-          <w:color w:val="3366CC"/>
-          <w:sz w:val="18"/>
-        </w:rPr>
-        <w:t>https://www.theverge.com/ai-artificial-intelligence/970115/openai-chatgpt-health-launch-claims</w:t>
-      </w:r>
-    </w:p>
-    <w:p/>
-    <w:p>
-      <w:pPr>
-        <w:pStyle w:val="Heading3"/>
-      </w:pPr>
-      <w:r>
-        <w:rPr>
-          <w:sz w:val="24"/>
-        </w:rPr>
-        <w:t>#4 ★★★★☆  Runway推出AI模型路由器应对生成式媒体竞争</w:t>
+        <w:t>#4 ★★★★☆  Runway推出AI模型路由器应对生成媒体拥挤赛道</w:t>
       </w:r>
     </w:p>
     <w:p>
@@ -206,7 +206,7 @@
         <w:pStyle w:val="ListBullet"/>
       </w:pPr>
       <w:r>
-        <w:t>Runway发布Media Router工具，可自动为图像、视频或音频生成请求选择最佳AI模型，基于质量、速度或成本优先级。该工具旨在帮助开发者在日益拥挤的生成式媒体市场中高效选择模型，优化资源利用。</w:t>
+        <w:t>Runway发布Media Router工具，可自动为图像、视频或音频生成请求选择最优AI模型，根据开发者对质量、速度或成本的优先级进行智能路由。此举旨在解决生成式AI媒体领域模型过多、选择困难的问题。</w:t>
       </w:r>
     </w:p>
     <w:p>
@@ -227,7 +227,7 @@
         <w:rPr>
           <w:sz w:val="24"/>
         </w:rPr>
-        <w:t>#5 ★★★★☆  前Google安全高管创立的AegisAI获3600万美元融资</w:t>
+        <w:t>#5 ★★★★☆  AegisAI获3600万美元融资防御AI驱动的鱼叉式钓鱼攻击</w:t>
       </w:r>
     </w:p>
     <w:p>
@@ -244,7 +244,7 @@
         <w:pStyle w:val="ListBullet"/>
       </w:pPr>
       <w:r>
-        <w:t>由前Google安全高管创立的AegisAI获得3600万美元融资，开发AI代理抵御AI驱动的鱼叉式钓鱼攻击。其技术能像人类一样分析每条消息的微小异常，针对日益复杂的AI生成钓鱼威胁提供新一代网络安全解决方案。</w:t>
+        <w:t>由前Google安全高管创立的AegisAI获得3600万美元融资，其开发的AI代理能像人类一样分析每条消息的细微异常，有效识别AI生成的鱼叉式钓鱼攻击。随着AI生成钓鱼邮件日益猖獗，该技术对网络安全行业具有重大意义。</w:t>
       </w:r>
     </w:p>
     <w:p>
@@ -265,83 +265,7 @@
         <w:rPr>
           <w:sz w:val="24"/>
         </w:rPr>
-        <w:t>#6 ★★★★☆  亚马逊Alexa Plus更新AI功能支持复杂智能家居指令</w:t>
-      </w:r>
-    </w:p>
-    <w:p>
-      <w:r>
-        <w:rPr>
-          <w:color w:val="888888"/>
-          <w:sz w:val="18"/>
-        </w:rPr>
-        <w:t>来源: The Verge</w:t>
-      </w:r>
-    </w:p>
-    <w:p>
-      <w:pPr>
-        <w:pStyle w:val="ListBullet"/>
-      </w:pPr>
-      <w:r>
-        <w:t>亚马逊为Alexa Plus推出AI更新，增强与Bosch、iRobot等品牌的智能家居设备联动能力。更新后的Alexa Plus能处理更复杂的指令，标志着智能助手在家庭自动化领域的重大进步，提升用户控制体验。</w:t>
-      </w:r>
-    </w:p>
-    <w:p>
-      <w:r>
-        <w:rPr>
-          <w:color w:val="3366CC"/>
-          <w:sz w:val="18"/>
-        </w:rPr>
-        <w:t>https://www.theverge.com/tech/970399/amazon-alexa-plus-ai-update-smart-home-devices</w:t>
-      </w:r>
-    </w:p>
-    <w:p/>
-    <w:p>
-      <w:pPr>
-        <w:pStyle w:val="Heading3"/>
-      </w:pPr>
-      <w:r>
-        <w:rPr>
-          <w:sz w:val="24"/>
-        </w:rPr>
-        <w:t>#7 ★★★★☆  Hugging Face与SkyPilot推出零出口AI存储方案</w:t>
-      </w:r>
-    </w:p>
-    <w:p>
-      <w:r>
-        <w:rPr>
-          <w:color w:val="888888"/>
-          <w:sz w:val="18"/>
-        </w:rPr>
-        <w:t>来源: Hugging Face - Blog</w:t>
-      </w:r>
-    </w:p>
-    <w:p>
-      <w:pPr>
-        <w:pStyle w:val="ListBullet"/>
-      </w:pPr>
-      <w:r>
-        <w:t>Hugging Face与SkyPilot合作推出零出口存储方案，允许AI工作负载在任何云上运行而数据存储在Hugging Face。该方案解决了多云环境下的数据迁移成本问题，为AI开发者提供更灵活高效的基础设施选择。</w:t>
-      </w:r>
-    </w:p>
-    <w:p>
-      <w:r>
-        <w:rPr>
-          <w:color w:val="3366CC"/>
-          <w:sz w:val="18"/>
-        </w:rPr>
-        <w:t>https://huggingface.co/blog/skypilot-hf-storage</w:t>
-      </w:r>
-    </w:p>
-    <w:p/>
-    <w:p>
-      <w:pPr>
-        <w:pStyle w:val="Heading3"/>
-      </w:pPr>
-      <w:r>
-        <w:rPr>
-          <w:sz w:val="24"/>
-        </w:rPr>
-        <w:t>#8 ★★★★☆  Mobileye CEO将卸任，公司转向自动驾驶出租车和机器人</w:t>
+        <w:t>#6 ★★★★☆  AI安全护栏阻碍网络安全研究人员工作</w:t>
       </w:r>
     </w:p>
     <w:p>
@@ -358,7 +282,83 @@
         <w:pStyle w:val="ListBullet"/>
       </w:pPr>
       <w:r>
-        <w:t>Mobileye宣布CEO Amnon Shashua将卸任并转任董事长，公司战略重心转向自动驾驶出租车和机器人领域。这一领导层变动反映了自动驾驶行业从辅助驾驶向完全无人驾驶服务的转型趋势。</w:t>
+        <w:t>多位网络安全研究人员反映，OpenAI和Anthropic的AI安全护栏严重阻碍了其发现漏洞和开发渗透工具的工作。这些本用于防止AI滥用的限制措施，反而让安全专家难以利用AI进行合法的攻击性安全研究。</w:t>
+      </w:r>
+    </w:p>
+    <w:p>
+      <w:r>
+        <w:rPr>
+          <w:color w:val="3366CC"/>
+          <w:sz w:val="18"/>
+        </w:rPr>
+        <w:t>https://techcrunch.com/2026/07/23/how-ai-guardrails-are-impeding-the-work-of-offensive-cybersecurity-researchers/</w:t>
+      </w:r>
+    </w:p>
+    <w:p/>
+    <w:p>
+      <w:pPr>
+        <w:pStyle w:val="Heading3"/>
+      </w:pPr>
+      <w:r>
+        <w:rPr>
+          <w:sz w:val="24"/>
+        </w:rPr>
+        <w:t>#7 ★★★★☆  菲尔兹奖得主加盟OpenAI</w:t>
+      </w:r>
+    </w:p>
+    <w:p>
+      <w:r>
+        <w:rPr>
+          <w:color w:val="888888"/>
+          <w:sz w:val="18"/>
+        </w:rPr>
+        <w:t>来源: 爱范儿</w:t>
+      </w:r>
+    </w:p>
+    <w:p>
+      <w:pPr>
+        <w:pStyle w:val="ListBullet"/>
+      </w:pPr>
+      <w:r>
+        <w:t>最新菲尔兹奖得主宣布加入OpenAI，标志着全球顶尖数学家集体向AI领域流动的趋势。这一人才动向凸显了AI基础理论研究对数学人才的迫切需求，以及学术界与产业界在AI前沿探索上的深度融合。</w:t>
+      </w:r>
+    </w:p>
+    <w:p>
+      <w:r>
+        <w:rPr>
+          <w:color w:val="3366CC"/>
+          <w:sz w:val="18"/>
+        </w:rPr>
+        <w:t>https://www.ifanr.com/1673003</w:t>
+      </w:r>
+    </w:p>
+    <w:p/>
+    <w:p>
+      <w:pPr>
+        <w:pStyle w:val="Heading3"/>
+      </w:pPr>
+      <w:r>
+        <w:rPr>
+          <w:sz w:val="24"/>
+        </w:rPr>
+        <w:t>#8 ★★★★☆  Mobileye CEO将卸任，公司转向机器人出租车和机器人领域</w:t>
+      </w:r>
+    </w:p>
+    <w:p>
+      <w:r>
+        <w:rPr>
+          <w:color w:val="888888"/>
+          <w:sz w:val="18"/>
+        </w:rPr>
+        <w:t>来源: TechCrunch</w:t>
+      </w:r>
+    </w:p>
+    <w:p>
+      <w:pPr>
+        <w:pStyle w:val="ListBullet"/>
+      </w:pPr>
+      <w:r>
+        <w:t>Mobileye CEO Amnon Shashua将卸任并受邀担任董事会主席。公司战略重心转向机器人出租车和机器人技术，这一高层变动预示着自动驾驶行业正经历重大转型，从辅助驾驶向全自动驾驶和通用机器人领域拓展。</w:t>
       </w:r>
     </w:p>
     <w:p>
@@ -379,7 +379,7 @@
         <w:rPr>
           <w:sz w:val="24"/>
         </w:rPr>
-        <w:t>#9 ★★★☆☆  AI护栏阻碍网络安全研究人员工作</w:t>
+        <w:t>#9 ★★★★☆  特斯拉机器人出租车里程逆势下滑36%</w:t>
       </w:r>
     </w:p>
     <w:p>
@@ -396,7 +396,7 @@
         <w:pStyle w:val="ListBullet"/>
       </w:pPr>
       <w:r>
-        <w:t>TechCrunch报道称，OpenAI和Anthropic的AI护栏正在阻碍进攻性网络安全研究人员的工作。这些研究人员需要寻找未知漏洞和开发利用工具，但AI模型的限制影响了他们的研究效率，引发对AI安全政策平衡的讨论。</w:t>
+        <w:t>尽管扩展到新城市，特斯拉付费机器人出租车里程在第二季度却下降了36%。这一数据与马斯克的乐观言论形成鲜明对比，引发市场对特斯拉自动驾驶商业化进程的质疑，凸显了其与Waymo等竞争对手的差距。</w:t>
       </w:r>
     </w:p>
     <w:p>
@@ -405,7 +405,7 @@
           <w:color w:val="3366CC"/>
           <w:sz w:val="18"/>
         </w:rPr>
-        <w:t>https://techcrunch.com/2026/07/23/how-ai-guardrails-are-impeding-the-work-of-offensive-cybersecurity-researchers/</w:t>
+        <w:t>https://techcrunch.com/2026/07/23/teslas-robotaxis-are-moving-in-reverse/</w:t>
       </w:r>
     </w:p>
     <w:p/>
@@ -417,7 +417,7 @@
         <w:rPr>
           <w:sz w:val="24"/>
         </w:rPr>
-        <w:t>#10 ★★★☆☆  Tesla机器人出租车里程下降36%</w:t>
+        <w:t>#10 ★★★★☆  Hugging Face发布Nunchaku 4-bit扩散模型推理方案</w:t>
       </w:r>
     </w:p>
     <w:p>
@@ -426,7 +426,7 @@
           <w:color w:val="888888"/>
           <w:sz w:val="18"/>
         </w:rPr>
-        <w:t>来源: TechCrunch</w:t>
+        <w:t>来源: Hugging Face - Blog</w:t>
       </w:r>
     </w:p>
     <w:p>
@@ -434,7 +434,7 @@
         <w:pStyle w:val="ListBullet"/>
       </w:pPr>
       <w:r>
-        <w:t>尽管扩展到新城市，特斯拉第二季度付费机器人出租车里程数下降36%。CEO马斯克在财报电话会议上仍持乐观态度，但数据与承诺形成鲜明对比，凸显自动驾驶出租车商业化面临的现实挑战。</w:t>
+        <w:t>Hugging Face在Diffusers库中集成Nunchaku 4-bit量化扩散模型推理方案，大幅降低扩散模型的推理成本和内存占用。这一技术突破将使高质量图像生成在消费级硬件上成为可能，加速AI内容创作工具的普及。</w:t>
       </w:r>
     </w:p>
     <w:p>
@@ -443,7 +443,7 @@
           <w:color w:val="3366CC"/>
           <w:sz w:val="18"/>
         </w:rPr>
-        <w:t>https://techcrunch.com/2026/07/23/teslas-robotaxis-are-moving-in-reverse/</w:t>
+        <w:t>https://huggingface.co/blog/nunchaku-diffusers</w:t>
       </w:r>
     </w:p>
     <w:p/>

</xml_diff>